<commit_message>
Fix Streamlit Cloud deployment
- Remove pyproject.toml: its only content was stale pytest config for the
  now-archived test suite, but its mere presence made Streamlit Cloud invoke
  Poetry, which failed validation (no [project]/[tool.poetry] name/version).
- Add a root requirements.txt with just the 4 packages the app actually
  imports (streamlit, polars, pandas, altair); remove the stale
  backend/requirements.txt (still listed scikit-learn/plotly from the
  archived ML pipeline).
- Un-ignore readmission_dataset.csv and backend/models/metrics_log.jsonl in
  .gitignore — both were never committed, so the app would crash with
  FileNotFoundError on Cloud even after the Poetry fix. Data is synthetic,
  safe to publish.
- Remove a stray Word lock file (~$...docx) that was accidentally tracked.

Co-Authored-By: Claude Sonnet 5 <noreply@anthropic.com>
</commit_message>
<xml_diff>
--- a/NHS_Readmission_Dashboard_Guide.docx
+++ b/NHS_Readmission_Dashboard_Guide.docx
@@ -213,7 +213,741 @@
         <w:t xml:space="preserve">LACE score</w:t>
       </w:r>
       <w:r>
-        <w:t xml:space="preserve"> — a well-known method used across the NHS to estimate readmission risk. It simply adds up points for four things about the patient:</w:t>
+        <w:t xml:space="preserve"> — a well-known method used across the NHS to estimate readmission risk. The name is short for the four things it adds points for: </w:t>
+      </w:r>
+      <w:r>
+        <w:rPr>
+          <w:b/>
+          <w:bCs/>
+        </w:rPr>
+        <w:t xml:space="preserve">L</w:t>
+      </w:r>
+      <w:r>
+        <w:t xml:space="preserve">ength of stay, </w:t>
+      </w:r>
+      <w:r>
+        <w:rPr>
+          <w:b/>
+          <w:bCs/>
+        </w:rPr>
+        <w:t xml:space="preserve">A</w:t>
+      </w:r>
+      <w:r>
+        <w:t xml:space="preserve">cuity of admission, </w:t>
+      </w:r>
+      <w:r>
+        <w:rPr>
+          <w:b/>
+          <w:bCs/>
+        </w:rPr>
+        <w:t xml:space="preserve">C</w:t>
+      </w:r>
+      <w:r>
+        <w:t xml:space="preserve">omorbidity, and </w:t>
+      </w:r>
+      <w:r>
+        <w:rPr>
+          <w:b/>
+          <w:bCs/>
+        </w:rPr>
+        <w:t xml:space="preserve">E</w:t>
+      </w:r>
+      <w:r>
+        <w:t xml:space="preserve">mergency admissions beforehand. The four numbers are simply added together to get a total between </w:t>
+      </w:r>
+      <w:r>
+        <w:rPr>
+          <w:b/>
+          <w:bCs/>
+        </w:rPr>
+        <w:t xml:space="preserve">0 and 19</w:t>
+      </w:r>
+      <w:r>
+        <w:t xml:space="preserve"> — the higher the number, the higher the risk.</w:t>
+      </w:r>
+    </w:p>
+    <w:p>
+      <w:pPr>
+        <w:spacing w:after="60" w:before="160"/>
+      </w:pPr>
+      <w:r>
+        <w:rPr>
+          <w:b/>
+          <w:bCs/>
+          <w:color w:val="005EB8"/>
+          <w:sz w:val="23"/>
+          <w:szCs w:val="23"/>
+        </w:rPr>
+        <w:t xml:space="preserve">L — Length of stay</w:t>
+      </w:r>
+    </w:p>
+    <w:p>
+      <w:pPr>
+        <w:spacing w:after="120" w:line="276"/>
+      </w:pPr>
+      <w:r>
+        <w:t xml:space="preserve">How many days the patient spent in hospital this time. Longer stays usually mean a more complex, higher-risk episode.</w:t>
+      </w:r>
+    </w:p>
+    <w:tbl>
+      <w:tblPr>
+        <w:tblW w:type="dxa" w:w="7200"/>
+        <w:tblBorders>
+          <w:top w:val="single" w:color="auto" w:sz="4"/>
+          <w:left w:val="single" w:color="auto" w:sz="4"/>
+          <w:bottom w:val="single" w:color="auto" w:sz="4"/>
+          <w:right w:val="single" w:color="auto" w:sz="4"/>
+          <w:insideH w:val="single" w:color="auto" w:sz="4"/>
+          <w:insideV w:val="single" w:color="auto" w:sz="4"/>
+        </w:tblBorders>
+      </w:tblPr>
+      <w:tblGrid>
+        <w:gridCol w:w="4200"/>
+        <w:gridCol w:w="3000"/>
+      </w:tblGrid>
+      <w:tr>
+        <w:trPr>
+          <w:tblHeader/>
+        </w:trPr>
+        <w:tc>
+          <w:tcPr>
+            <w:tcW w:type="dxa" w:w="4200"/>
+            <w:shd w:fill="005EB8" w:color="auto" w:val="clear"/>
+            <w:tcMar>
+              <w:top w:type="dxa" w:w="60"/>
+              <w:left w:type="dxa" w:w="120"/>
+              <w:bottom w:type="dxa" w:w="60"/>
+              <w:right w:type="dxa" w:w="120"/>
+            </w:tcMar>
+          </w:tcPr>
+          <w:p>
+            <w:r>
+              <w:rPr>
+                <w:b/>
+                <w:bCs/>
+                <w:color w:val="FFFFFF"/>
+                <w:sz w:val="20"/>
+                <w:szCs w:val="20"/>
+              </w:rPr>
+              <w:t xml:space="preserve">Days in hospital</w:t>
+            </w:r>
+          </w:p>
+        </w:tc>
+        <w:tc>
+          <w:tcPr>
+            <w:tcW w:type="dxa" w:w="3000"/>
+            <w:shd w:fill="005EB8" w:color="auto" w:val="clear"/>
+            <w:tcMar>
+              <w:top w:type="dxa" w:w="60"/>
+              <w:left w:type="dxa" w:w="120"/>
+              <w:bottom w:type="dxa" w:w="60"/>
+              <w:right w:type="dxa" w:w="120"/>
+            </w:tcMar>
+          </w:tcPr>
+          <w:p>
+            <w:pPr>
+              <w:jc w:val="center"/>
+            </w:pPr>
+            <w:r>
+              <w:rPr>
+                <w:b/>
+                <w:bCs/>
+                <w:color w:val="FFFFFF"/>
+                <w:sz w:val="20"/>
+                <w:szCs w:val="20"/>
+              </w:rPr>
+              <w:t xml:space="preserve">Points</w:t>
+            </w:r>
+          </w:p>
+        </w:tc>
+      </w:tr>
+      <w:tr>
+        <w:tc>
+          <w:tcPr>
+            <w:tcW w:type="dxa" w:w="4200"/>
+            <w:shd w:fill="F0F4F5" w:color="auto" w:val="clear"/>
+            <w:tcMar>
+              <w:top w:type="dxa" w:w="60"/>
+              <w:left w:type="dxa" w:w="120"/>
+              <w:bottom w:type="dxa" w:w="60"/>
+              <w:right w:type="dxa" w:w="120"/>
+            </w:tcMar>
+          </w:tcPr>
+          <w:p>
+            <w:r>
+              <w:rPr>
+                <w:b w:val="false"/>
+                <w:bCs w:val="false"/>
+                <w:color w:val="212B32"/>
+                <w:sz w:val="20"/>
+                <w:szCs w:val="20"/>
+              </w:rPr>
+              <w:t xml:space="preserve">Less than 1 day</w:t>
+            </w:r>
+          </w:p>
+        </w:tc>
+        <w:tc>
+          <w:tcPr>
+            <w:tcW w:type="dxa" w:w="3000"/>
+            <w:shd w:fill="F0F4F5" w:color="auto" w:val="clear"/>
+            <w:tcMar>
+              <w:top w:type="dxa" w:w="60"/>
+              <w:left w:type="dxa" w:w="120"/>
+              <w:bottom w:type="dxa" w:w="60"/>
+              <w:right w:type="dxa" w:w="120"/>
+            </w:tcMar>
+          </w:tcPr>
+          <w:p>
+            <w:pPr>
+              <w:jc w:val="center"/>
+            </w:pPr>
+            <w:r>
+              <w:rPr>
+                <w:b w:val="false"/>
+                <w:bCs w:val="false"/>
+                <w:color w:val="212B32"/>
+                <w:sz w:val="20"/>
+                <w:szCs w:val="20"/>
+              </w:rPr>
+              <w:t xml:space="preserve">0</w:t>
+            </w:r>
+          </w:p>
+        </w:tc>
+      </w:tr>
+      <w:tr>
+        <w:tc>
+          <w:tcPr>
+            <w:tcW w:type="dxa" w:w="4200"/>
+            <w:tcMar>
+              <w:top w:type="dxa" w:w="60"/>
+              <w:left w:type="dxa" w:w="120"/>
+              <w:bottom w:type="dxa" w:w="60"/>
+              <w:right w:type="dxa" w:w="120"/>
+            </w:tcMar>
+          </w:tcPr>
+          <w:p>
+            <w:r>
+              <w:rPr>
+                <w:b w:val="false"/>
+                <w:bCs w:val="false"/>
+                <w:color w:val="212B32"/>
+                <w:sz w:val="20"/>
+                <w:szCs w:val="20"/>
+              </w:rPr>
+              <w:t xml:space="preserve">1 day</w:t>
+            </w:r>
+          </w:p>
+        </w:tc>
+        <w:tc>
+          <w:tcPr>
+            <w:tcW w:type="dxa" w:w="3000"/>
+            <w:tcMar>
+              <w:top w:type="dxa" w:w="60"/>
+              <w:left w:type="dxa" w:w="120"/>
+              <w:bottom w:type="dxa" w:w="60"/>
+              <w:right w:type="dxa" w:w="120"/>
+            </w:tcMar>
+          </w:tcPr>
+          <w:p>
+            <w:pPr>
+              <w:jc w:val="center"/>
+            </w:pPr>
+            <w:r>
+              <w:rPr>
+                <w:b w:val="false"/>
+                <w:bCs w:val="false"/>
+                <w:color w:val="212B32"/>
+                <w:sz w:val="20"/>
+                <w:szCs w:val="20"/>
+              </w:rPr>
+              <w:t xml:space="preserve">1</w:t>
+            </w:r>
+          </w:p>
+        </w:tc>
+      </w:tr>
+      <w:tr>
+        <w:tc>
+          <w:tcPr>
+            <w:tcW w:type="dxa" w:w="4200"/>
+            <w:shd w:fill="F0F4F5" w:color="auto" w:val="clear"/>
+            <w:tcMar>
+              <w:top w:type="dxa" w:w="60"/>
+              <w:left w:type="dxa" w:w="120"/>
+              <w:bottom w:type="dxa" w:w="60"/>
+              <w:right w:type="dxa" w:w="120"/>
+            </w:tcMar>
+          </w:tcPr>
+          <w:p>
+            <w:r>
+              <w:rPr>
+                <w:b w:val="false"/>
+                <w:bCs w:val="false"/>
+                <w:color w:val="212B32"/>
+                <w:sz w:val="20"/>
+                <w:szCs w:val="20"/>
+              </w:rPr>
+              <w:t xml:space="preserve">2 days</w:t>
+            </w:r>
+          </w:p>
+        </w:tc>
+        <w:tc>
+          <w:tcPr>
+            <w:tcW w:type="dxa" w:w="3000"/>
+            <w:shd w:fill="F0F4F5" w:color="auto" w:val="clear"/>
+            <w:tcMar>
+              <w:top w:type="dxa" w:w="60"/>
+              <w:left w:type="dxa" w:w="120"/>
+              <w:bottom w:type="dxa" w:w="60"/>
+              <w:right w:type="dxa" w:w="120"/>
+            </w:tcMar>
+          </w:tcPr>
+          <w:p>
+            <w:pPr>
+              <w:jc w:val="center"/>
+            </w:pPr>
+            <w:r>
+              <w:rPr>
+                <w:b w:val="false"/>
+                <w:bCs w:val="false"/>
+                <w:color w:val="212B32"/>
+                <w:sz w:val="20"/>
+                <w:szCs w:val="20"/>
+              </w:rPr>
+              <w:t xml:space="preserve">2</w:t>
+            </w:r>
+          </w:p>
+        </w:tc>
+      </w:tr>
+      <w:tr>
+        <w:tc>
+          <w:tcPr>
+            <w:tcW w:type="dxa" w:w="4200"/>
+            <w:tcMar>
+              <w:top w:type="dxa" w:w="60"/>
+              <w:left w:type="dxa" w:w="120"/>
+              <w:bottom w:type="dxa" w:w="60"/>
+              <w:right w:type="dxa" w:w="120"/>
+            </w:tcMar>
+          </w:tcPr>
+          <w:p>
+            <w:r>
+              <w:rPr>
+                <w:b w:val="false"/>
+                <w:bCs w:val="false"/>
+                <w:color w:val="212B32"/>
+                <w:sz w:val="20"/>
+                <w:szCs w:val="20"/>
+              </w:rPr>
+              <w:t xml:space="preserve">3 days</w:t>
+            </w:r>
+          </w:p>
+        </w:tc>
+        <w:tc>
+          <w:tcPr>
+            <w:tcW w:type="dxa" w:w="3000"/>
+            <w:tcMar>
+              <w:top w:type="dxa" w:w="60"/>
+              <w:left w:type="dxa" w:w="120"/>
+              <w:bottom w:type="dxa" w:w="60"/>
+              <w:right w:type="dxa" w:w="120"/>
+            </w:tcMar>
+          </w:tcPr>
+          <w:p>
+            <w:pPr>
+              <w:jc w:val="center"/>
+            </w:pPr>
+            <w:r>
+              <w:rPr>
+                <w:b w:val="false"/>
+                <w:bCs w:val="false"/>
+                <w:color w:val="212B32"/>
+                <w:sz w:val="20"/>
+                <w:szCs w:val="20"/>
+              </w:rPr>
+              <w:t xml:space="preserve">3</w:t>
+            </w:r>
+          </w:p>
+        </w:tc>
+      </w:tr>
+      <w:tr>
+        <w:tc>
+          <w:tcPr>
+            <w:tcW w:type="dxa" w:w="4200"/>
+            <w:shd w:fill="F0F4F5" w:color="auto" w:val="clear"/>
+            <w:tcMar>
+              <w:top w:type="dxa" w:w="60"/>
+              <w:left w:type="dxa" w:w="120"/>
+              <w:bottom w:type="dxa" w:w="60"/>
+              <w:right w:type="dxa" w:w="120"/>
+            </w:tcMar>
+          </w:tcPr>
+          <w:p>
+            <w:r>
+              <w:rPr>
+                <w:b w:val="false"/>
+                <w:bCs w:val="false"/>
+                <w:color w:val="212B32"/>
+                <w:sz w:val="20"/>
+                <w:szCs w:val="20"/>
+              </w:rPr>
+              <w:t xml:space="preserve">4 – 6 days</w:t>
+            </w:r>
+          </w:p>
+        </w:tc>
+        <w:tc>
+          <w:tcPr>
+            <w:tcW w:type="dxa" w:w="3000"/>
+            <w:shd w:fill="F0F4F5" w:color="auto" w:val="clear"/>
+            <w:tcMar>
+              <w:top w:type="dxa" w:w="60"/>
+              <w:left w:type="dxa" w:w="120"/>
+              <w:bottom w:type="dxa" w:w="60"/>
+              <w:right w:type="dxa" w:w="120"/>
+            </w:tcMar>
+          </w:tcPr>
+          <w:p>
+            <w:pPr>
+              <w:jc w:val="center"/>
+            </w:pPr>
+            <w:r>
+              <w:rPr>
+                <w:b w:val="false"/>
+                <w:bCs w:val="false"/>
+                <w:color w:val="212B32"/>
+                <w:sz w:val="20"/>
+                <w:szCs w:val="20"/>
+              </w:rPr>
+              <w:t xml:space="preserve">4</w:t>
+            </w:r>
+          </w:p>
+        </w:tc>
+      </w:tr>
+      <w:tr>
+        <w:tc>
+          <w:tcPr>
+            <w:tcW w:type="dxa" w:w="4200"/>
+            <w:tcMar>
+              <w:top w:type="dxa" w:w="60"/>
+              <w:left w:type="dxa" w:w="120"/>
+              <w:bottom w:type="dxa" w:w="60"/>
+              <w:right w:type="dxa" w:w="120"/>
+            </w:tcMar>
+          </w:tcPr>
+          <w:p>
+            <w:r>
+              <w:rPr>
+                <w:b w:val="false"/>
+                <w:bCs w:val="false"/>
+                <w:color w:val="212B32"/>
+                <w:sz w:val="20"/>
+                <w:szCs w:val="20"/>
+              </w:rPr>
+              <w:t xml:space="preserve">7 – 13 days</w:t>
+            </w:r>
+          </w:p>
+        </w:tc>
+        <w:tc>
+          <w:tcPr>
+            <w:tcW w:type="dxa" w:w="3000"/>
+            <w:tcMar>
+              <w:top w:type="dxa" w:w="60"/>
+              <w:left w:type="dxa" w:w="120"/>
+              <w:bottom w:type="dxa" w:w="60"/>
+              <w:right w:type="dxa" w:w="120"/>
+            </w:tcMar>
+          </w:tcPr>
+          <w:p>
+            <w:pPr>
+              <w:jc w:val="center"/>
+            </w:pPr>
+            <w:r>
+              <w:rPr>
+                <w:b w:val="false"/>
+                <w:bCs w:val="false"/>
+                <w:color w:val="212B32"/>
+                <w:sz w:val="20"/>
+                <w:szCs w:val="20"/>
+              </w:rPr>
+              <w:t xml:space="preserve">5</w:t>
+            </w:r>
+          </w:p>
+        </w:tc>
+      </w:tr>
+      <w:tr>
+        <w:tc>
+          <w:tcPr>
+            <w:tcW w:type="dxa" w:w="4200"/>
+            <w:shd w:fill="F0F4F5" w:color="auto" w:val="clear"/>
+            <w:tcMar>
+              <w:top w:type="dxa" w:w="60"/>
+              <w:left w:type="dxa" w:w="120"/>
+              <w:bottom w:type="dxa" w:w="60"/>
+              <w:right w:type="dxa" w:w="120"/>
+            </w:tcMar>
+          </w:tcPr>
+          <w:p>
+            <w:r>
+              <w:rPr>
+                <w:b w:val="false"/>
+                <w:bCs w:val="false"/>
+                <w:color w:val="212B32"/>
+                <w:sz w:val="20"/>
+                <w:szCs w:val="20"/>
+              </w:rPr>
+              <w:t xml:space="preserve">14 days or more</w:t>
+            </w:r>
+          </w:p>
+        </w:tc>
+        <w:tc>
+          <w:tcPr>
+            <w:tcW w:type="dxa" w:w="3000"/>
+            <w:shd w:fill="F0F4F5" w:color="auto" w:val="clear"/>
+            <w:tcMar>
+              <w:top w:type="dxa" w:w="60"/>
+              <w:left w:type="dxa" w:w="120"/>
+              <w:bottom w:type="dxa" w:w="60"/>
+              <w:right w:type="dxa" w:w="120"/>
+            </w:tcMar>
+          </w:tcPr>
+          <w:p>
+            <w:pPr>
+              <w:jc w:val="center"/>
+            </w:pPr>
+            <w:r>
+              <w:rPr>
+                <w:b w:val="false"/>
+                <w:bCs w:val="false"/>
+                <w:color w:val="212B32"/>
+                <w:sz w:val="20"/>
+                <w:szCs w:val="20"/>
+              </w:rPr>
+              <w:t xml:space="preserve">7</w:t>
+            </w:r>
+          </w:p>
+        </w:tc>
+      </w:tr>
+    </w:tbl>
+    <w:p>
+      <w:pPr>
+        <w:spacing w:after="60" w:before="160"/>
+      </w:pPr>
+      <w:r>
+        <w:rPr>
+          <w:b/>
+          <w:bCs/>
+          <w:color w:val="005EB8"/>
+          <w:sz w:val="23"/>
+          <w:szCs w:val="23"/>
+        </w:rPr>
+        <w:t xml:space="preserve">A — Acuity of admission</w:t>
+      </w:r>
+    </w:p>
+    <w:p>
+      <w:pPr>
+        <w:spacing w:after="120" w:before="100"/>
+      </w:pPr>
+      <w:r>
+        <w:t xml:space="preserve">Whether the patient was admitted as an emergency, or whether it was planned in advance.</w:t>
+      </w:r>
+    </w:p>
+    <w:tbl>
+      <w:tblPr>
+        <w:tblW w:type="dxa" w:w="7200"/>
+        <w:tblBorders>
+          <w:top w:val="single" w:color="auto" w:sz="4"/>
+          <w:left w:val="single" w:color="auto" w:sz="4"/>
+          <w:bottom w:val="single" w:color="auto" w:sz="4"/>
+          <w:right w:val="single" w:color="auto" w:sz="4"/>
+          <w:insideH w:val="single" w:color="auto" w:sz="4"/>
+          <w:insideV w:val="single" w:color="auto" w:sz="4"/>
+        </w:tblBorders>
+      </w:tblPr>
+      <w:tblGrid>
+        <w:gridCol w:w="4200"/>
+        <w:gridCol w:w="3000"/>
+      </w:tblGrid>
+      <w:tr>
+        <w:trPr>
+          <w:tblHeader/>
+        </w:trPr>
+        <w:tc>
+          <w:tcPr>
+            <w:tcW w:type="dxa" w:w="4200"/>
+            <w:shd w:fill="005EB8" w:color="auto" w:val="clear"/>
+            <w:tcMar>
+              <w:top w:type="dxa" w:w="60"/>
+              <w:left w:type="dxa" w:w="120"/>
+              <w:bottom w:type="dxa" w:w="60"/>
+              <w:right w:type="dxa" w:w="120"/>
+            </w:tcMar>
+          </w:tcPr>
+          <w:p>
+            <w:r>
+              <w:rPr>
+                <w:b/>
+                <w:bCs/>
+                <w:color w:val="FFFFFF"/>
+                <w:sz w:val="20"/>
+                <w:szCs w:val="20"/>
+              </w:rPr>
+              <w:t xml:space="preserve">Type of admission</w:t>
+            </w:r>
+          </w:p>
+        </w:tc>
+        <w:tc>
+          <w:tcPr>
+            <w:tcW w:type="dxa" w:w="3000"/>
+            <w:shd w:fill="005EB8" w:color="auto" w:val="clear"/>
+            <w:tcMar>
+              <w:top w:type="dxa" w:w="60"/>
+              <w:left w:type="dxa" w:w="120"/>
+              <w:bottom w:type="dxa" w:w="60"/>
+              <w:right w:type="dxa" w:w="120"/>
+            </w:tcMar>
+          </w:tcPr>
+          <w:p>
+            <w:pPr>
+              <w:jc w:val="center"/>
+            </w:pPr>
+            <w:r>
+              <w:rPr>
+                <w:b/>
+                <w:bCs/>
+                <w:color w:val="FFFFFF"/>
+                <w:sz w:val="20"/>
+                <w:szCs w:val="20"/>
+              </w:rPr>
+              <w:t xml:space="preserve">Points</w:t>
+            </w:r>
+          </w:p>
+        </w:tc>
+      </w:tr>
+      <w:tr>
+        <w:tc>
+          <w:tcPr>
+            <w:tcW w:type="dxa" w:w="4200"/>
+            <w:shd w:fill="F0F4F5" w:color="auto" w:val="clear"/>
+            <w:tcMar>
+              <w:top w:type="dxa" w:w="60"/>
+              <w:left w:type="dxa" w:w="120"/>
+              <w:bottom w:type="dxa" w:w="60"/>
+              <w:right w:type="dxa" w:w="120"/>
+            </w:tcMar>
+          </w:tcPr>
+          <w:p>
+            <w:r>
+              <w:rPr>
+                <w:b w:val="false"/>
+                <w:bCs w:val="false"/>
+                <w:color w:val="212B32"/>
+                <w:sz w:val="20"/>
+                <w:szCs w:val="20"/>
+              </w:rPr>
+              <w:t xml:space="preserve">Emergency or Urgent (unplanned)</w:t>
+            </w:r>
+          </w:p>
+        </w:tc>
+        <w:tc>
+          <w:tcPr>
+            <w:tcW w:type="dxa" w:w="3000"/>
+            <w:shd w:fill="F0F4F5" w:color="auto" w:val="clear"/>
+            <w:tcMar>
+              <w:top w:type="dxa" w:w="60"/>
+              <w:left w:type="dxa" w:w="120"/>
+              <w:bottom w:type="dxa" w:w="60"/>
+              <w:right w:type="dxa" w:w="120"/>
+            </w:tcMar>
+          </w:tcPr>
+          <w:p>
+            <w:pPr>
+              <w:jc w:val="center"/>
+            </w:pPr>
+            <w:r>
+              <w:rPr>
+                <w:b w:val="false"/>
+                <w:bCs w:val="false"/>
+                <w:color w:val="212B32"/>
+                <w:sz w:val="20"/>
+                <w:szCs w:val="20"/>
+              </w:rPr>
+              <w:t xml:space="preserve">3</w:t>
+            </w:r>
+          </w:p>
+        </w:tc>
+      </w:tr>
+      <w:tr>
+        <w:tc>
+          <w:tcPr>
+            <w:tcW w:type="dxa" w:w="4200"/>
+            <w:tcMar>
+              <w:top w:type="dxa" w:w="60"/>
+              <w:left w:type="dxa" w:w="120"/>
+              <w:bottom w:type="dxa" w:w="60"/>
+              <w:right w:type="dxa" w:w="120"/>
+            </w:tcMar>
+          </w:tcPr>
+          <w:p>
+            <w:r>
+              <w:rPr>
+                <w:b w:val="false"/>
+                <w:bCs w:val="false"/>
+                <w:color w:val="212B32"/>
+                <w:sz w:val="20"/>
+                <w:szCs w:val="20"/>
+              </w:rPr>
+              <w:t xml:space="preserve">Elective (planned in advance)</w:t>
+            </w:r>
+          </w:p>
+        </w:tc>
+        <w:tc>
+          <w:tcPr>
+            <w:tcW w:type="dxa" w:w="3000"/>
+            <w:tcMar>
+              <w:top w:type="dxa" w:w="60"/>
+              <w:left w:type="dxa" w:w="120"/>
+              <w:bottom w:type="dxa" w:w="60"/>
+              <w:right w:type="dxa" w:w="120"/>
+            </w:tcMar>
+          </w:tcPr>
+          <w:p>
+            <w:pPr>
+              <w:jc w:val="center"/>
+            </w:pPr>
+            <w:r>
+              <w:rPr>
+                <w:b w:val="false"/>
+                <w:bCs w:val="false"/>
+                <w:color w:val="212B32"/>
+                <w:sz w:val="20"/>
+                <w:szCs w:val="20"/>
+              </w:rPr>
+              <w:t xml:space="preserve">0</w:t>
+            </w:r>
+          </w:p>
+        </w:tc>
+      </w:tr>
+    </w:tbl>
+    <w:p>
+      <w:pPr>
+        <w:spacing w:after="60" w:before="160"/>
+      </w:pPr>
+      <w:r>
+        <w:rPr>
+          <w:b/>
+          <w:bCs/>
+          <w:color w:val="005EB8"/>
+          <w:sz w:val="23"/>
+          <w:szCs w:val="23"/>
+        </w:rPr>
+        <w:t xml:space="preserve">C — Comorbidity</w:t>
+      </w:r>
+    </w:p>
+    <w:p>
+      <w:pPr>
+        <w:spacing w:after="120" w:before="100"/>
+      </w:pPr>
+      <w:r>
+        <w:t xml:space="preserve">Whether the patient has other ongoing health conditions alongside the reason for this admission. Maximum 5 points.</w:t>
       </w:r>
     </w:p>
     <w:p>
@@ -226,14 +960,14 @@
         <w:spacing w:after="60" w:line="268"/>
       </w:pPr>
       <w:r>
-        <w:rPr>
-          <w:b/>
-          <w:bCs/>
-        </w:rPr>
-        <w:t xml:space="preserve">L — Length of stay: </w:t>
-      </w:r>
-      <w:r>
-        <w:t xml:space="preserve">longer hospital stays score more points.</w:t>
+        <w:t xml:space="preserve">+1 point if the patient has </w:t>
+      </w:r>
+      <w:r>
+        <w:rPr>
+          <w:b/>
+          <w:bCs/>
+        </w:rPr>
+        <w:t xml:space="preserve">any documented comorbidity</w:t>
       </w:r>
     </w:p>
     <w:p>
@@ -246,72 +980,404 @@
         <w:spacing w:after="60" w:line="268"/>
       </w:pPr>
       <w:r>
-        <w:rPr>
-          <w:b/>
-          <w:bCs/>
-        </w:rPr>
-        <w:t xml:space="preserve">A — Acute admission: </w:t>
-      </w:r>
-      <w:r>
-        <w:t xml:space="preserve">unplanned emergency or urgent admissions score more.</w:t>
-      </w:r>
-    </w:p>
-    <w:p>
-      <w:pPr>
-        <w:pStyle w:val="ListParagraph"/>
-        <w:numPr>
-          <w:ilvl w:val="0"/>
-          <w:numId w:val="2"/>
-        </w:numPr>
-        <w:spacing w:after="60" w:line="268"/>
-      </w:pPr>
-      <w:r>
-        <w:rPr>
-          <w:b/>
-          <w:bCs/>
-        </w:rPr>
-        <w:t xml:space="preserve">C — Comorbidity: </w:t>
-      </w:r>
-      <w:r>
-        <w:t xml:space="preserve">having other long-term health conditions adds points.</w:t>
-      </w:r>
-    </w:p>
-    <w:p>
-      <w:pPr>
-        <w:pStyle w:val="ListParagraph"/>
-        <w:numPr>
-          <w:ilvl w:val="0"/>
-          <w:numId w:val="2"/>
-        </w:numPr>
-        <w:spacing w:after="60" w:line="268"/>
-      </w:pPr>
-      <w:r>
-        <w:rPr>
-          <w:b/>
-          <w:bCs/>
-        </w:rPr>
-        <w:t xml:space="preserve">E — Emergency admissions before: </w:t>
-      </w:r>
-      <w:r>
-        <w:t xml:space="preserve">a history of emergency admissions is the strongest signal.</w:t>
-      </w:r>
-    </w:p>
-    <w:p>
-      <w:pPr>
-        <w:spacing w:after="120" w:line="276"/>
-      </w:pPr>
-      <w:r>
-        <w:t xml:space="preserve">The four parts add up to a total between </w:t>
-      </w:r>
-      <w:r>
-        <w:rPr>
-          <w:b/>
-          <w:bCs/>
-        </w:rPr>
-        <w:t xml:space="preserve">0 and 19</w:t>
-      </w:r>
-      <w:r>
-        <w:t xml:space="preserve">. The higher the number, the higher the risk. Patients are then grouped into three tiers:</w:t>
+        <w:t xml:space="preserve">+1 point if their main diagnosis is a serious long-term condition — in this data, </w:t>
+      </w:r>
+      <w:r>
+        <w:rPr>
+          <w:b/>
+          <w:bCs/>
+        </w:rPr>
+        <w:t xml:space="preserve">type 2 diabetes</w:t>
+      </w:r>
+      <w:r>
+        <w:t xml:space="preserve"> or </w:t>
+      </w:r>
+      <w:r>
+        <w:rPr>
+          <w:b/>
+          <w:bCs/>
+        </w:rPr>
+        <w:t xml:space="preserve">ischaemic heart disease</w:t>
+      </w:r>
+    </w:p>
+    <w:p>
+      <w:pPr>
+        <w:spacing w:after="60" w:before="160"/>
+      </w:pPr>
+      <w:r>
+        <w:rPr>
+          <w:b/>
+          <w:bCs/>
+          <w:color w:val="005EB8"/>
+          <w:sz w:val="23"/>
+          <w:szCs w:val="23"/>
+        </w:rPr>
+        <w:t xml:space="preserve">E — Emergency admissions beforehand</w:t>
+      </w:r>
+    </w:p>
+    <w:p>
+      <w:pPr>
+        <w:spacing w:after="120" w:before="100"/>
+      </w:pPr>
+      <w:r>
+        <w:t xml:space="preserve">How many times the patient has already been admitted as an emergency in the past. This is the single strongest warning sign. Maximum 4 points.</w:t>
+      </w:r>
+    </w:p>
+    <w:tbl>
+      <w:tblPr>
+        <w:tblW w:type="dxa" w:w="7200"/>
+        <w:tblBorders>
+          <w:top w:val="single" w:color="auto" w:sz="4"/>
+          <w:left w:val="single" w:color="auto" w:sz="4"/>
+          <w:bottom w:val="single" w:color="auto" w:sz="4"/>
+          <w:right w:val="single" w:color="auto" w:sz="4"/>
+          <w:insideH w:val="single" w:color="auto" w:sz="4"/>
+          <w:insideV w:val="single" w:color="auto" w:sz="4"/>
+        </w:tblBorders>
+      </w:tblPr>
+      <w:tblGrid>
+        <w:gridCol w:w="4200"/>
+        <w:gridCol w:w="3000"/>
+      </w:tblGrid>
+      <w:tr>
+        <w:trPr>
+          <w:tblHeader/>
+        </w:trPr>
+        <w:tc>
+          <w:tcPr>
+            <w:tcW w:type="dxa" w:w="4200"/>
+            <w:shd w:fill="005EB8" w:color="auto" w:val="clear"/>
+            <w:tcMar>
+              <w:top w:type="dxa" w:w="60"/>
+              <w:left w:type="dxa" w:w="120"/>
+              <w:bottom w:type="dxa" w:w="60"/>
+              <w:right w:type="dxa" w:w="120"/>
+            </w:tcMar>
+          </w:tcPr>
+          <w:p>
+            <w:r>
+              <w:rPr>
+                <w:b/>
+                <w:bCs/>
+                <w:color w:val="FFFFFF"/>
+                <w:sz w:val="20"/>
+                <w:szCs w:val="20"/>
+              </w:rPr>
+              <w:t xml:space="preserve">Prior emergency admissions</w:t>
+            </w:r>
+          </w:p>
+        </w:tc>
+        <w:tc>
+          <w:tcPr>
+            <w:tcW w:type="dxa" w:w="3000"/>
+            <w:shd w:fill="005EB8" w:color="auto" w:val="clear"/>
+            <w:tcMar>
+              <w:top w:type="dxa" w:w="60"/>
+              <w:left w:type="dxa" w:w="120"/>
+              <w:bottom w:type="dxa" w:w="60"/>
+              <w:right w:type="dxa" w:w="120"/>
+            </w:tcMar>
+          </w:tcPr>
+          <w:p>
+            <w:pPr>
+              <w:jc w:val="center"/>
+            </w:pPr>
+            <w:r>
+              <w:rPr>
+                <w:b/>
+                <w:bCs/>
+                <w:color w:val="FFFFFF"/>
+                <w:sz w:val="20"/>
+                <w:szCs w:val="20"/>
+              </w:rPr>
+              <w:t xml:space="preserve">Points</w:t>
+            </w:r>
+          </w:p>
+        </w:tc>
+      </w:tr>
+      <w:tr>
+        <w:tc>
+          <w:tcPr>
+            <w:tcW w:type="dxa" w:w="4200"/>
+            <w:shd w:fill="F0F4F5" w:color="auto" w:val="clear"/>
+            <w:tcMar>
+              <w:top w:type="dxa" w:w="60"/>
+              <w:left w:type="dxa" w:w="120"/>
+              <w:bottom w:type="dxa" w:w="60"/>
+              <w:right w:type="dxa" w:w="120"/>
+            </w:tcMar>
+          </w:tcPr>
+          <w:p>
+            <w:r>
+              <w:rPr>
+                <w:b w:val="false"/>
+                <w:bCs w:val="false"/>
+                <w:color w:val="212B32"/>
+                <w:sz w:val="20"/>
+                <w:szCs w:val="20"/>
+              </w:rPr>
+              <w:t xml:space="preserve">0</w:t>
+            </w:r>
+          </w:p>
+        </w:tc>
+        <w:tc>
+          <w:tcPr>
+            <w:tcW w:type="dxa" w:w="3000"/>
+            <w:shd w:fill="F0F4F5" w:color="auto" w:val="clear"/>
+            <w:tcMar>
+              <w:top w:type="dxa" w:w="60"/>
+              <w:left w:type="dxa" w:w="120"/>
+              <w:bottom w:type="dxa" w:w="60"/>
+              <w:right w:type="dxa" w:w="120"/>
+            </w:tcMar>
+          </w:tcPr>
+          <w:p>
+            <w:pPr>
+              <w:jc w:val="center"/>
+            </w:pPr>
+            <w:r>
+              <w:rPr>
+                <w:b w:val="false"/>
+                <w:bCs w:val="false"/>
+                <w:color w:val="212B32"/>
+                <w:sz w:val="20"/>
+                <w:szCs w:val="20"/>
+              </w:rPr>
+              <w:t xml:space="preserve">0</w:t>
+            </w:r>
+          </w:p>
+        </w:tc>
+      </w:tr>
+      <w:tr>
+        <w:tc>
+          <w:tcPr>
+            <w:tcW w:type="dxa" w:w="4200"/>
+            <w:tcMar>
+              <w:top w:type="dxa" w:w="60"/>
+              <w:left w:type="dxa" w:w="120"/>
+              <w:bottom w:type="dxa" w:w="60"/>
+              <w:right w:type="dxa" w:w="120"/>
+            </w:tcMar>
+          </w:tcPr>
+          <w:p>
+            <w:r>
+              <w:rPr>
+                <w:b w:val="false"/>
+                <w:bCs w:val="false"/>
+                <w:color w:val="212B32"/>
+                <w:sz w:val="20"/>
+                <w:szCs w:val="20"/>
+              </w:rPr>
+              <w:t xml:space="preserve">1</w:t>
+            </w:r>
+          </w:p>
+        </w:tc>
+        <w:tc>
+          <w:tcPr>
+            <w:tcW w:type="dxa" w:w="3000"/>
+            <w:tcMar>
+              <w:top w:type="dxa" w:w="60"/>
+              <w:left w:type="dxa" w:w="120"/>
+              <w:bottom w:type="dxa" w:w="60"/>
+              <w:right w:type="dxa" w:w="120"/>
+            </w:tcMar>
+          </w:tcPr>
+          <w:p>
+            <w:pPr>
+              <w:jc w:val="center"/>
+            </w:pPr>
+            <w:r>
+              <w:rPr>
+                <w:b w:val="false"/>
+                <w:bCs w:val="false"/>
+                <w:color w:val="212B32"/>
+                <w:sz w:val="20"/>
+                <w:szCs w:val="20"/>
+              </w:rPr>
+              <w:t xml:space="preserve">1</w:t>
+            </w:r>
+          </w:p>
+        </w:tc>
+      </w:tr>
+      <w:tr>
+        <w:tc>
+          <w:tcPr>
+            <w:tcW w:type="dxa" w:w="4200"/>
+            <w:shd w:fill="F0F4F5" w:color="auto" w:val="clear"/>
+            <w:tcMar>
+              <w:top w:type="dxa" w:w="60"/>
+              <w:left w:type="dxa" w:w="120"/>
+              <w:bottom w:type="dxa" w:w="60"/>
+              <w:right w:type="dxa" w:w="120"/>
+            </w:tcMar>
+          </w:tcPr>
+          <w:p>
+            <w:r>
+              <w:rPr>
+                <w:b w:val="false"/>
+                <w:bCs w:val="false"/>
+                <w:color w:val="212B32"/>
+                <w:sz w:val="20"/>
+                <w:szCs w:val="20"/>
+              </w:rPr>
+              <w:t xml:space="preserve">2</w:t>
+            </w:r>
+          </w:p>
+        </w:tc>
+        <w:tc>
+          <w:tcPr>
+            <w:tcW w:type="dxa" w:w="3000"/>
+            <w:shd w:fill="F0F4F5" w:color="auto" w:val="clear"/>
+            <w:tcMar>
+              <w:top w:type="dxa" w:w="60"/>
+              <w:left w:type="dxa" w:w="120"/>
+              <w:bottom w:type="dxa" w:w="60"/>
+              <w:right w:type="dxa" w:w="120"/>
+            </w:tcMar>
+          </w:tcPr>
+          <w:p>
+            <w:pPr>
+              <w:jc w:val="center"/>
+            </w:pPr>
+            <w:r>
+              <w:rPr>
+                <w:b w:val="false"/>
+                <w:bCs w:val="false"/>
+                <w:color w:val="212B32"/>
+                <w:sz w:val="20"/>
+                <w:szCs w:val="20"/>
+              </w:rPr>
+              <w:t xml:space="preserve">2</w:t>
+            </w:r>
+          </w:p>
+        </w:tc>
+      </w:tr>
+      <w:tr>
+        <w:tc>
+          <w:tcPr>
+            <w:tcW w:type="dxa" w:w="4200"/>
+            <w:tcMar>
+              <w:top w:type="dxa" w:w="60"/>
+              <w:left w:type="dxa" w:w="120"/>
+              <w:bottom w:type="dxa" w:w="60"/>
+              <w:right w:type="dxa" w:w="120"/>
+            </w:tcMar>
+          </w:tcPr>
+          <w:p>
+            <w:r>
+              <w:rPr>
+                <w:b w:val="false"/>
+                <w:bCs w:val="false"/>
+                <w:color w:val="212B32"/>
+                <w:sz w:val="20"/>
+                <w:szCs w:val="20"/>
+              </w:rPr>
+              <w:t xml:space="preserve">3</w:t>
+            </w:r>
+          </w:p>
+        </w:tc>
+        <w:tc>
+          <w:tcPr>
+            <w:tcW w:type="dxa" w:w="3000"/>
+            <w:tcMar>
+              <w:top w:type="dxa" w:w="60"/>
+              <w:left w:type="dxa" w:w="120"/>
+              <w:bottom w:type="dxa" w:w="60"/>
+              <w:right w:type="dxa" w:w="120"/>
+            </w:tcMar>
+          </w:tcPr>
+          <w:p>
+            <w:pPr>
+              <w:jc w:val="center"/>
+            </w:pPr>
+            <w:r>
+              <w:rPr>
+                <w:b w:val="false"/>
+                <w:bCs w:val="false"/>
+                <w:color w:val="212B32"/>
+                <w:sz w:val="20"/>
+                <w:szCs w:val="20"/>
+              </w:rPr>
+              <w:t xml:space="preserve">3</w:t>
+            </w:r>
+          </w:p>
+        </w:tc>
+      </w:tr>
+      <w:tr>
+        <w:tc>
+          <w:tcPr>
+            <w:tcW w:type="dxa" w:w="4200"/>
+            <w:shd w:fill="F0F4F5" w:color="auto" w:val="clear"/>
+            <w:tcMar>
+              <w:top w:type="dxa" w:w="60"/>
+              <w:left w:type="dxa" w:w="120"/>
+              <w:bottom w:type="dxa" w:w="60"/>
+              <w:right w:type="dxa" w:w="120"/>
+            </w:tcMar>
+          </w:tcPr>
+          <w:p>
+            <w:r>
+              <w:rPr>
+                <w:b w:val="false"/>
+                <w:bCs w:val="false"/>
+                <w:color w:val="212B32"/>
+                <w:sz w:val="20"/>
+                <w:szCs w:val="20"/>
+              </w:rPr>
+              <w:t xml:space="preserve">4 or more</w:t>
+            </w:r>
+          </w:p>
+        </w:tc>
+        <w:tc>
+          <w:tcPr>
+            <w:tcW w:type="dxa" w:w="3000"/>
+            <w:shd w:fill="F0F4F5" w:color="auto" w:val="clear"/>
+            <w:tcMar>
+              <w:top w:type="dxa" w:w="60"/>
+              <w:left w:type="dxa" w:w="120"/>
+              <w:bottom w:type="dxa" w:w="60"/>
+              <w:right w:type="dxa" w:w="120"/>
+            </w:tcMar>
+          </w:tcPr>
+          <w:p>
+            <w:pPr>
+              <w:jc w:val="center"/>
+            </w:pPr>
+            <w:r>
+              <w:rPr>
+                <w:b w:val="false"/>
+                <w:bCs w:val="false"/>
+                <w:color w:val="212B32"/>
+                <w:sz w:val="20"/>
+                <w:szCs w:val="20"/>
+              </w:rPr>
+              <w:t xml:space="preserve">4</w:t>
+            </w:r>
+          </w:p>
+        </w:tc>
+      </w:tr>
+    </w:tbl>
+    <w:p>
+      <w:pPr>
+        <w:spacing w:after="60" w:before="160"/>
+      </w:pPr>
+      <w:r>
+        <w:rPr>
+          <w:b/>
+          <w:bCs/>
+          <w:color w:val="005EB8"/>
+          <w:sz w:val="23"/>
+          <w:szCs w:val="23"/>
+        </w:rPr>
+        <w:t xml:space="preserve">Turning the total into a risk tier</w:t>
+      </w:r>
+    </w:p>
+    <w:p>
+      <w:pPr>
+        <w:spacing w:after="120" w:before="100"/>
+      </w:pPr>
+      <w:r>
+        <w:t xml:space="preserve">The four numbers (L + A + C + E) are added together. The total decides the patient's risk tier:</w:t>
       </w:r>
     </w:p>
     <w:tbl>
@@ -624,7 +1690,540 @@
     </w:tbl>
     <w:p>
       <w:pPr>
-        <w:spacing w:after="120" w:before="160"/>
+        <w:spacing w:after="60" w:before="160"/>
+      </w:pPr>
+      <w:r>
+        <w:rPr>
+          <w:b/>
+          <w:bCs/>
+          <w:color w:val="005EB8"/>
+          <w:sz w:val="23"/>
+          <w:szCs w:val="23"/>
+        </w:rPr>
+        <w:t xml:space="preserve">Worked example</w:t>
+      </w:r>
+    </w:p>
+    <w:p>
+      <w:pPr>
+        <w:spacing w:after="100" w:before="100"/>
+      </w:pPr>
+      <w:r>
+        <w:t xml:space="preserve">A real patient from the dashboard: </w:t>
+      </w:r>
+      <w:r>
+        <w:rPr>
+          <w:i/>
+          <w:iCs/>
+        </w:rPr>
+        <w:t xml:space="preserve">6 days in hospital, an urgent admission, one comorbidity, and 3 prior emergency admissions.</w:t>
+      </w:r>
+    </w:p>
+    <w:tbl>
+      <w:tblPr>
+        <w:tblW w:type="dxa" w:w="9000"/>
+        <w:tblBorders>
+          <w:top w:val="single" w:color="auto" w:sz="4"/>
+          <w:left w:val="single" w:color="auto" w:sz="4"/>
+          <w:bottom w:val="single" w:color="auto" w:sz="4"/>
+          <w:right w:val="single" w:color="auto" w:sz="4"/>
+          <w:insideH w:val="single" w:color="auto" w:sz="4"/>
+          <w:insideV w:val="single" w:color="auto" w:sz="4"/>
+        </w:tblBorders>
+      </w:tblPr>
+      <w:tblGrid>
+        <w:gridCol w:w="2600"/>
+        <w:gridCol w:w="3800"/>
+        <w:gridCol w:w="2600"/>
+      </w:tblGrid>
+      <w:tr>
+        <w:trPr>
+          <w:tblHeader/>
+        </w:trPr>
+        <w:tc>
+          <w:tcPr>
+            <w:tcW w:type="dxa" w:w="2600"/>
+            <w:shd w:fill="005EB8" w:color="auto" w:val="clear"/>
+            <w:tcMar>
+              <w:top w:type="dxa" w:w="60"/>
+              <w:left w:type="dxa" w:w="120"/>
+              <w:bottom w:type="dxa" w:w="60"/>
+              <w:right w:type="dxa" w:w="120"/>
+            </w:tcMar>
+          </w:tcPr>
+          <w:p>
+            <w:r>
+              <w:rPr>
+                <w:b/>
+                <w:bCs/>
+                <w:color w:val="FFFFFF"/>
+                <w:sz w:val="20"/>
+                <w:szCs w:val="20"/>
+              </w:rPr>
+              <w:t xml:space="preserve">Component</w:t>
+            </w:r>
+          </w:p>
+        </w:tc>
+        <w:tc>
+          <w:tcPr>
+            <w:tcW w:type="dxa" w:w="3800"/>
+            <w:shd w:fill="005EB8" w:color="auto" w:val="clear"/>
+            <w:tcMar>
+              <w:top w:type="dxa" w:w="60"/>
+              <w:left w:type="dxa" w:w="120"/>
+              <w:bottom w:type="dxa" w:w="60"/>
+              <w:right w:type="dxa" w:w="120"/>
+            </w:tcMar>
+          </w:tcPr>
+          <w:p>
+            <w:r>
+              <w:rPr>
+                <w:b/>
+                <w:bCs/>
+                <w:color w:val="FFFFFF"/>
+                <w:sz w:val="20"/>
+                <w:szCs w:val="20"/>
+              </w:rPr>
+              <w:t xml:space="preserve">This patient</w:t>
+            </w:r>
+          </w:p>
+        </w:tc>
+        <w:tc>
+          <w:tcPr>
+            <w:tcW w:type="dxa" w:w="2600"/>
+            <w:shd w:fill="005EB8" w:color="auto" w:val="clear"/>
+            <w:tcMar>
+              <w:top w:type="dxa" w:w="60"/>
+              <w:left w:type="dxa" w:w="120"/>
+              <w:bottom w:type="dxa" w:w="60"/>
+              <w:right w:type="dxa" w:w="120"/>
+            </w:tcMar>
+          </w:tcPr>
+          <w:p>
+            <w:pPr>
+              <w:jc w:val="center"/>
+            </w:pPr>
+            <w:r>
+              <w:rPr>
+                <w:b/>
+                <w:bCs/>
+                <w:color w:val="FFFFFF"/>
+                <w:sz w:val="20"/>
+                <w:szCs w:val="20"/>
+              </w:rPr>
+              <w:t xml:space="preserve">Points</w:t>
+            </w:r>
+          </w:p>
+        </w:tc>
+      </w:tr>
+      <w:tr>
+        <w:tc>
+          <w:tcPr>
+            <w:tcW w:type="dxa" w:w="2600"/>
+            <w:shd w:fill="F0F4F5" w:color="auto" w:val="clear"/>
+            <w:tcMar>
+              <w:top w:type="dxa" w:w="60"/>
+              <w:left w:type="dxa" w:w="120"/>
+              <w:bottom w:type="dxa" w:w="60"/>
+              <w:right w:type="dxa" w:w="120"/>
+            </w:tcMar>
+          </w:tcPr>
+          <w:p>
+            <w:r>
+              <w:rPr>
+                <w:b w:val="false"/>
+                <w:bCs w:val="false"/>
+                <w:color w:val="212B32"/>
+                <w:sz w:val="20"/>
+                <w:szCs w:val="20"/>
+              </w:rPr>
+              <w:t xml:space="preserve">L — Length of stay</w:t>
+            </w:r>
+          </w:p>
+        </w:tc>
+        <w:tc>
+          <w:tcPr>
+            <w:tcW w:type="dxa" w:w="3800"/>
+            <w:shd w:fill="F0F4F5" w:color="auto" w:val="clear"/>
+            <w:tcMar>
+              <w:top w:type="dxa" w:w="60"/>
+              <w:left w:type="dxa" w:w="120"/>
+              <w:bottom w:type="dxa" w:w="60"/>
+              <w:right w:type="dxa" w:w="120"/>
+            </w:tcMar>
+          </w:tcPr>
+          <w:p>
+            <w:r>
+              <w:rPr>
+                <w:b w:val="false"/>
+                <w:bCs w:val="false"/>
+                <w:color w:val="212B32"/>
+                <w:sz w:val="20"/>
+                <w:szCs w:val="20"/>
+              </w:rPr>
+              <w:t xml:space="preserve">6 days → falls in the 4–6 day band</w:t>
+            </w:r>
+          </w:p>
+        </w:tc>
+        <w:tc>
+          <w:tcPr>
+            <w:tcW w:type="dxa" w:w="2600"/>
+            <w:shd w:fill="F0F4F5" w:color="auto" w:val="clear"/>
+            <w:tcMar>
+              <w:top w:type="dxa" w:w="60"/>
+              <w:left w:type="dxa" w:w="120"/>
+              <w:bottom w:type="dxa" w:w="60"/>
+              <w:right w:type="dxa" w:w="120"/>
+            </w:tcMar>
+          </w:tcPr>
+          <w:p>
+            <w:pPr>
+              <w:jc w:val="center"/>
+            </w:pPr>
+            <w:r>
+              <w:rPr>
+                <w:b w:val="false"/>
+                <w:bCs w:val="false"/>
+                <w:color w:val="212B32"/>
+                <w:sz w:val="20"/>
+                <w:szCs w:val="20"/>
+              </w:rPr>
+              <w:t xml:space="preserve">4</w:t>
+            </w:r>
+          </w:p>
+        </w:tc>
+      </w:tr>
+      <w:tr>
+        <w:tc>
+          <w:tcPr>
+            <w:tcW w:type="dxa" w:w="2600"/>
+            <w:tcMar>
+              <w:top w:type="dxa" w:w="60"/>
+              <w:left w:type="dxa" w:w="120"/>
+              <w:bottom w:type="dxa" w:w="60"/>
+              <w:right w:type="dxa" w:w="120"/>
+            </w:tcMar>
+          </w:tcPr>
+          <w:p>
+            <w:r>
+              <w:rPr>
+                <w:b w:val="false"/>
+                <w:bCs w:val="false"/>
+                <w:color w:val="212B32"/>
+                <w:sz w:val="20"/>
+                <w:szCs w:val="20"/>
+              </w:rPr>
+              <w:t xml:space="preserve">A — Acuity</w:t>
+            </w:r>
+          </w:p>
+        </w:tc>
+        <w:tc>
+          <w:tcPr>
+            <w:tcW w:type="dxa" w:w="3800"/>
+            <w:tcMar>
+              <w:top w:type="dxa" w:w="60"/>
+              <w:left w:type="dxa" w:w="120"/>
+              <w:bottom w:type="dxa" w:w="60"/>
+              <w:right w:type="dxa" w:w="120"/>
+            </w:tcMar>
+          </w:tcPr>
+          <w:p>
+            <w:r>
+              <w:rPr>
+                <w:b w:val="false"/>
+                <w:bCs w:val="false"/>
+                <w:color w:val="212B32"/>
+                <w:sz w:val="20"/>
+                <w:szCs w:val="20"/>
+              </w:rPr>
+              <w:t xml:space="preserve">Urgent admission</w:t>
+            </w:r>
+          </w:p>
+        </w:tc>
+        <w:tc>
+          <w:tcPr>
+            <w:tcW w:type="dxa" w:w="2600"/>
+            <w:tcMar>
+              <w:top w:type="dxa" w:w="60"/>
+              <w:left w:type="dxa" w:w="120"/>
+              <w:bottom w:type="dxa" w:w="60"/>
+              <w:right w:type="dxa" w:w="120"/>
+            </w:tcMar>
+          </w:tcPr>
+          <w:p>
+            <w:pPr>
+              <w:jc w:val="center"/>
+            </w:pPr>
+            <w:r>
+              <w:rPr>
+                <w:b w:val="false"/>
+                <w:bCs w:val="false"/>
+                <w:color w:val="212B32"/>
+                <w:sz w:val="20"/>
+                <w:szCs w:val="20"/>
+              </w:rPr>
+              <w:t xml:space="preserve">3</w:t>
+            </w:r>
+          </w:p>
+        </w:tc>
+      </w:tr>
+      <w:tr>
+        <w:tc>
+          <w:tcPr>
+            <w:tcW w:type="dxa" w:w="2600"/>
+            <w:shd w:fill="F0F4F5" w:color="auto" w:val="clear"/>
+            <w:tcMar>
+              <w:top w:type="dxa" w:w="60"/>
+              <w:left w:type="dxa" w:w="120"/>
+              <w:bottom w:type="dxa" w:w="60"/>
+              <w:right w:type="dxa" w:w="120"/>
+            </w:tcMar>
+          </w:tcPr>
+          <w:p>
+            <w:r>
+              <w:rPr>
+                <w:b w:val="false"/>
+                <w:bCs w:val="false"/>
+                <w:color w:val="212B32"/>
+                <w:sz w:val="20"/>
+                <w:szCs w:val="20"/>
+              </w:rPr>
+              <w:t xml:space="preserve">C — Comorbidity</w:t>
+            </w:r>
+          </w:p>
+        </w:tc>
+        <w:tc>
+          <w:tcPr>
+            <w:tcW w:type="dxa" w:w="3800"/>
+            <w:shd w:fill="F0F4F5" w:color="auto" w:val="clear"/>
+            <w:tcMar>
+              <w:top w:type="dxa" w:w="60"/>
+              <w:left w:type="dxa" w:w="120"/>
+              <w:bottom w:type="dxa" w:w="60"/>
+              <w:right w:type="dxa" w:w="120"/>
+            </w:tcMar>
+          </w:tcPr>
+          <w:p>
+            <w:r>
+              <w:rPr>
+                <w:b w:val="false"/>
+                <w:bCs w:val="false"/>
+                <w:color w:val="212B32"/>
+                <w:sz w:val="20"/>
+                <w:szCs w:val="20"/>
+              </w:rPr>
+              <w:t xml:space="preserve">Has one documented comorbidity</w:t>
+            </w:r>
+          </w:p>
+        </w:tc>
+        <w:tc>
+          <w:tcPr>
+            <w:tcW w:type="dxa" w:w="2600"/>
+            <w:shd w:fill="F0F4F5" w:color="auto" w:val="clear"/>
+            <w:tcMar>
+              <w:top w:type="dxa" w:w="60"/>
+              <w:left w:type="dxa" w:w="120"/>
+              <w:bottom w:type="dxa" w:w="60"/>
+              <w:right w:type="dxa" w:w="120"/>
+            </w:tcMar>
+          </w:tcPr>
+          <w:p>
+            <w:pPr>
+              <w:jc w:val="center"/>
+            </w:pPr>
+            <w:r>
+              <w:rPr>
+                <w:b w:val="false"/>
+                <w:bCs w:val="false"/>
+                <w:color w:val="212B32"/>
+                <w:sz w:val="20"/>
+                <w:szCs w:val="20"/>
+              </w:rPr>
+              <w:t xml:space="preserve">1</w:t>
+            </w:r>
+          </w:p>
+        </w:tc>
+      </w:tr>
+      <w:tr>
+        <w:tc>
+          <w:tcPr>
+            <w:tcW w:type="dxa" w:w="2600"/>
+            <w:tcMar>
+              <w:top w:type="dxa" w:w="60"/>
+              <w:left w:type="dxa" w:w="120"/>
+              <w:bottom w:type="dxa" w:w="60"/>
+              <w:right w:type="dxa" w:w="120"/>
+            </w:tcMar>
+          </w:tcPr>
+          <w:p>
+            <w:r>
+              <w:rPr>
+                <w:b w:val="false"/>
+                <w:bCs w:val="false"/>
+                <w:color w:val="212B32"/>
+                <w:sz w:val="20"/>
+                <w:szCs w:val="20"/>
+              </w:rPr>
+              <w:t xml:space="preserve">E — Prior admissions</w:t>
+            </w:r>
+          </w:p>
+        </w:tc>
+        <w:tc>
+          <w:tcPr>
+            <w:tcW w:type="dxa" w:w="3800"/>
+            <w:tcMar>
+              <w:top w:type="dxa" w:w="60"/>
+              <w:left w:type="dxa" w:w="120"/>
+              <w:bottom w:type="dxa" w:w="60"/>
+              <w:right w:type="dxa" w:w="120"/>
+            </w:tcMar>
+          </w:tcPr>
+          <w:p>
+            <w:r>
+              <w:rPr>
+                <w:b w:val="false"/>
+                <w:bCs w:val="false"/>
+                <w:color w:val="212B32"/>
+                <w:sz w:val="20"/>
+                <w:szCs w:val="20"/>
+              </w:rPr>
+              <w:t xml:space="preserve">3 prior emergency admissions</w:t>
+            </w:r>
+          </w:p>
+        </w:tc>
+        <w:tc>
+          <w:tcPr>
+            <w:tcW w:type="dxa" w:w="2600"/>
+            <w:tcMar>
+              <w:top w:type="dxa" w:w="60"/>
+              <w:left w:type="dxa" w:w="120"/>
+              <w:bottom w:type="dxa" w:w="60"/>
+              <w:right w:type="dxa" w:w="120"/>
+            </w:tcMar>
+          </w:tcPr>
+          <w:p>
+            <w:pPr>
+              <w:jc w:val="center"/>
+            </w:pPr>
+            <w:r>
+              <w:rPr>
+                <w:b w:val="false"/>
+                <w:bCs w:val="false"/>
+                <w:color w:val="212B32"/>
+                <w:sz w:val="20"/>
+                <w:szCs w:val="20"/>
+              </w:rPr>
+              <w:t xml:space="preserve">3</w:t>
+            </w:r>
+          </w:p>
+        </w:tc>
+      </w:tr>
+      <w:tr>
+        <w:tc>
+          <w:tcPr>
+            <w:tcW w:type="dxa" w:w="2600"/>
+            <w:shd w:fill="F0F4F5" w:color="auto" w:val="clear"/>
+            <w:tcMar>
+              <w:top w:type="dxa" w:w="60"/>
+              <w:left w:type="dxa" w:w="120"/>
+              <w:bottom w:type="dxa" w:w="60"/>
+              <w:right w:type="dxa" w:w="120"/>
+            </w:tcMar>
+          </w:tcPr>
+          <w:p>
+            <w:r>
+              <w:rPr>
+                <w:b w:val="false"/>
+                <w:bCs w:val="false"/>
+                <w:color w:val="212B32"/>
+                <w:sz w:val="20"/>
+                <w:szCs w:val="20"/>
+              </w:rPr>
+              <w:t xml:space="preserve">Total</w:t>
+            </w:r>
+          </w:p>
+        </w:tc>
+        <w:tc>
+          <w:tcPr>
+            <w:tcW w:type="dxa" w:w="3800"/>
+            <w:shd w:fill="F0F4F5" w:color="auto" w:val="clear"/>
+            <w:tcMar>
+              <w:top w:type="dxa" w:w="60"/>
+              <w:left w:type="dxa" w:w="120"/>
+              <w:bottom w:type="dxa" w:w="60"/>
+              <w:right w:type="dxa" w:w="120"/>
+            </w:tcMar>
+          </w:tcPr>
+          <w:p>
+            <w:r>
+              <w:rPr>
+                <w:b w:val="false"/>
+                <w:bCs w:val="false"/>
+                <w:color w:val="212B32"/>
+                <w:sz w:val="20"/>
+                <w:szCs w:val="20"/>
+              </w:rPr>
+              <w:t xml:space="preserve">4 + 3 + 1 + 3</w:t>
+            </w:r>
+          </w:p>
+        </w:tc>
+        <w:tc>
+          <w:tcPr>
+            <w:tcW w:type="dxa" w:w="2600"/>
+            <w:shd w:fill="F0F4F5" w:color="auto" w:val="clear"/>
+            <w:tcMar>
+              <w:top w:type="dxa" w:w="60"/>
+              <w:left w:type="dxa" w:w="120"/>
+              <w:bottom w:type="dxa" w:w="60"/>
+              <w:right w:type="dxa" w:w="120"/>
+            </w:tcMar>
+          </w:tcPr>
+          <w:p>
+            <w:pPr>
+              <w:jc w:val="center"/>
+            </w:pPr>
+            <w:r>
+              <w:rPr>
+                <w:b w:val="false"/>
+                <w:bCs w:val="false"/>
+                <w:color w:val="D5281B"/>
+                <w:sz w:val="20"/>
+                <w:szCs w:val="20"/>
+              </w:rPr>
+              <w:t xml:space="preserve">11</w:t>
+            </w:r>
+          </w:p>
+        </w:tc>
+      </w:tr>
+    </w:tbl>
+    <w:p>
+      <w:pPr>
+        <w:spacing w:after="140" w:before="120"/>
+      </w:pPr>
+      <w:r>
+        <w:rPr>
+          <w:b/>
+          <w:bCs/>
+        </w:rPr>
+        <w:t xml:space="preserve">Result: </w:t>
+      </w:r>
+      <w:r>
+        <w:t xml:space="preserve">a score of 11 falls in the </w:t>
+      </w:r>
+      <w:r>
+        <w:rPr>
+          <w:b/>
+          <w:bCs/>
+          <w:color w:val="D5281B"/>
+        </w:rPr>
+        <w:t xml:space="preserve">High risk</w:t>
+      </w:r>
+      <w:r>
+        <w:t xml:space="preserve"> tier — this patient would be a candidate for proactive follow-up after discharge.</w:t>
+      </w:r>
+    </w:p>
+    <w:p>
+      <w:pPr>
+        <w:spacing w:after="120" w:line="276"/>
       </w:pPr>
       <w:r>
         <w:rPr>
@@ -635,6 +2234,21 @@
       </w:r>
       <w:r>
         <w:t xml:space="preserve">LACE is transparent — every point can be explained to a clinician, and you can always see exactly why a patient scored the way they did. It is a validated method from published clinical research, not a black box.</w:t>
+      </w:r>
+    </w:p>
+    <w:p>
+      <w:pPr>
+        <w:spacing w:after="160"/>
+      </w:pPr>
+      <w:r>
+        <w:rPr>
+          <w:b/>
+          <w:bCs/>
+        </w:rPr>
+        <w:t xml:space="preserve">A note on accuracy: </w:t>
+      </w:r>
+      <w:r>
+        <w:t xml:space="preserve">the true LACE index calculates the Comorbidity (C) score from a patient's full list of diagnoses. This dataset only records one primary diagnosis plus a yes/no comorbidity flag, so C here is a close approximation of the full method, not an exact match.</w:t>
       </w:r>
     </w:p>
     <w:p>
@@ -829,28 +2443,6 @@
       </w:pPr>
       <w:r>
         <w:t xml:space="preserve">This page documents the LACE method, the points behind each component, and an honest note on the data. It is there so you (and anyone you share results with) can see exactly how the scores were produced.</w:t>
-      </w:r>
-    </w:p>
-    <w:p>
-      <w:pPr>
-        <w:pStyle w:val="Heading1"/>
-        <w:spacing w:after="140" w:before="320"/>
-      </w:pPr>
-      <w:r>
-        <w:rPr>
-          <w:b/>
-          <w:bCs/>
-          <w:color w:val="005EB8"/>
-        </w:rPr>
-        <w:t xml:space="preserve">Reading a single patient's score</w:t>
-      </w:r>
-    </w:p>
-    <w:p>
-      <w:pPr>
-        <w:spacing w:after="120" w:line="276"/>
-      </w:pPr>
-      <w:r>
-        <w:t xml:space="preserve">On the Risk stratification page, choose a patient from the dropdown. You will see their total LACE score, their risk tier as a coloured label, and a small bar chart showing how each of the four factors contributed. For example, a patient might score 11 (High) mostly because of a long stay and several previous emergency admissions — and the chart makes that reason visible at a glance.</w:t>
       </w:r>
     </w:p>
     <w:p>

</xml_diff>